<commit_message>
Update lab 4 typos
</commit_message>
<xml_diff>
--- a/lab_4/questions_lab4_32a_comm_num.docx
+++ b/lab_4/questions_lab4_32a_comm_num.docx
@@ -374,64 +374,6 @@
           <w:lang w:val="fr-CA"/>
         </w:rPr>
       </w:pPr>
-      <w:r>
-        <w:rPr>
-          <w:lang w:val="fr-CA"/>
-        </w:rPr>
-        <w:t>Trame à l’oscilloscope ici :</w:t>
-      </w:r>
-    </w:p>
-    <w:p>
-      <w:pPr>
-        <w:rPr>
-          <w:lang w:val="fr-CA"/>
-        </w:rPr>
-      </w:pPr>
-      <w:r>
-        <w:rPr>
-          <w:lang w:val="fr-CA"/>
-        </w:rPr>
-        <w:t>.</w:t>
-      </w:r>
-    </w:p>
-    <w:p>
-      <w:pPr>
-        <w:rPr>
-          <w:lang w:val="fr-CA"/>
-        </w:rPr>
-      </w:pPr>
-      <w:r>
-        <w:rPr>
-          <w:lang w:val="fr-CA"/>
-        </w:rPr>
-        <w:t>.</w:t>
-      </w:r>
-    </w:p>
-    <w:p>
-      <w:pPr>
-        <w:rPr>
-          <w:lang w:val="fr-CA"/>
-        </w:rPr>
-      </w:pPr>
-      <w:r>
-        <w:rPr>
-          <w:lang w:val="fr-CA"/>
-        </w:rPr>
-        <w:t>.</w:t>
-      </w:r>
-    </w:p>
-    <w:p>
-      <w:pPr>
-        <w:rPr>
-          <w:lang w:val="fr-CA"/>
-        </w:rPr>
-      </w:pPr>
-      <w:r>
-        <w:rPr>
-          <w:lang w:val="fr-CA"/>
-        </w:rPr>
-        <w:t>.</w:t>
-      </w:r>
     </w:p>
     <w:p>
       <w:pPr>
@@ -444,345 +386,436 @@
         <w:rPr>
           <w:lang w:val="fr-CA"/>
         </w:rPr>
+        <w:t xml:space="preserve">Partie </w:t>
+      </w:r>
+      <w:r>
+        <w:rPr>
+          <w:lang w:val="fr-CA"/>
+        </w:rPr>
+        <w:t>2</w:t>
+      </w:r>
+      <w:r>
+        <w:rPr>
+          <w:lang w:val="fr-CA"/>
+        </w:rPr>
+        <w:t xml:space="preserve"> (INFRAROUGE)</w:t>
+      </w:r>
+    </w:p>
+    <w:p>
+      <w:pPr>
+        <w:rPr>
+          <w:lang w:val="fr-CA"/>
+        </w:rPr>
+      </w:pPr>
+      <w:r>
+        <w:rPr>
+          <w:lang w:val="fr-CA"/>
+        </w:rPr>
+        <w:t>Trame à l’oscilloscope de ‘0’</w:t>
+      </w:r>
+    </w:p>
+    <w:p>
+      <w:pPr>
+        <w:rPr>
+          <w:lang w:val="fr-CA"/>
+        </w:rPr>
+      </w:pPr>
+      <w:r>
+        <w:rPr>
+          <w:lang w:val="fr-CA"/>
+        </w:rPr>
+        <w:t>.</w:t>
+      </w:r>
+    </w:p>
+    <w:p>
+      <w:pPr>
+        <w:rPr>
+          <w:lang w:val="fr-CA"/>
+        </w:rPr>
+      </w:pPr>
+      <w:r>
+        <w:rPr>
+          <w:lang w:val="fr-CA"/>
+        </w:rPr>
+        <w:t>.</w:t>
+      </w:r>
+    </w:p>
+    <w:p>
+      <w:pPr>
+        <w:rPr>
+          <w:lang w:val="fr-CA"/>
+        </w:rPr>
+      </w:pPr>
+      <w:r>
+        <w:rPr>
+          <w:lang w:val="fr-CA"/>
+        </w:rPr>
         <w:lastRenderedPageBreak/>
+        <w:t>.</w:t>
+      </w:r>
+    </w:p>
+    <w:p>
+      <w:pPr>
+        <w:rPr>
+          <w:lang w:val="fr-CA"/>
+        </w:rPr>
+      </w:pPr>
+      <w:r>
+        <w:rPr>
+          <w:lang w:val="fr-CA"/>
+        </w:rPr>
+        <w:t>.</w:t>
+      </w:r>
+    </w:p>
+    <w:p>
+      <w:pPr>
+        <w:rPr>
+          <w:lang w:val="fr-CA"/>
+        </w:rPr>
+      </w:pPr>
+      <w:r>
+        <w:rPr>
+          <w:lang w:val="fr-CA"/>
+        </w:rPr>
+        <w:t>Trame à l’oscilloscope de ‘REPEAT’</w:t>
+      </w:r>
+    </w:p>
+    <w:p>
+      <w:pPr>
+        <w:rPr>
+          <w:lang w:val="fr-CA"/>
+        </w:rPr>
+      </w:pPr>
+      <w:r>
+        <w:rPr>
+          <w:lang w:val="fr-CA"/>
+        </w:rPr>
+        <w:t>.</w:t>
+      </w:r>
+    </w:p>
+    <w:p>
+      <w:pPr>
+        <w:rPr>
+          <w:lang w:val="fr-CA"/>
+        </w:rPr>
+      </w:pPr>
+      <w:r>
+        <w:rPr>
+          <w:lang w:val="fr-CA"/>
+        </w:rPr>
+        <w:t>.</w:t>
+      </w:r>
+    </w:p>
+    <w:p>
+      <w:pPr>
+        <w:rPr>
+          <w:lang w:val="fr-CA"/>
+        </w:rPr>
+      </w:pPr>
+      <w:r>
+        <w:rPr>
+          <w:lang w:val="fr-CA"/>
+        </w:rPr>
+        <w:t>.</w:t>
+      </w:r>
+    </w:p>
+    <w:p>
+      <w:pPr>
+        <w:rPr>
+          <w:lang w:val="fr-CA"/>
+        </w:rPr>
+      </w:pPr>
+      <w:r>
+        <w:rPr>
+          <w:lang w:val="fr-CA"/>
+        </w:rPr>
+        <w:t>.</w:t>
+      </w:r>
+    </w:p>
+    <w:p>
+      <w:pPr>
+        <w:rPr>
+          <w:lang w:val="fr-CA"/>
+        </w:rPr>
+      </w:pPr>
+      <w:r>
+        <w:rPr>
+          <w:lang w:val="fr-CA"/>
+        </w:rPr>
+        <w:t>Distance entre les trames ‘REPEAT’?</w:t>
+      </w:r>
+      <w:r>
+        <w:rPr>
+          <w:lang w:val="fr-CA"/>
+        </w:rPr>
+        <w:t xml:space="preserve"> (En ms)</w:t>
+      </w:r>
+    </w:p>
+    <w:p>
+      <w:pPr>
+        <w:rPr>
+          <w:lang w:val="fr-CA"/>
+        </w:rPr>
+      </w:pPr>
+      <w:r>
+        <w:rPr>
+          <w:lang w:val="fr-CA"/>
+        </w:rPr>
+        <w:t>.</w:t>
+      </w:r>
+    </w:p>
+    <w:p>
+      <w:pPr>
+        <w:rPr>
+          <w:lang w:val="fr-CA"/>
+        </w:rPr>
+      </w:pPr>
+      <w:r>
+        <w:rPr>
+          <w:lang w:val="fr-CA"/>
+        </w:rPr>
+        <w:t>.</w:t>
+      </w:r>
+    </w:p>
+    <w:p>
+      <w:pPr>
+        <w:rPr>
+          <w:lang w:val="fr-CA"/>
+        </w:rPr>
+      </w:pPr>
+      <w:r>
+        <w:rPr>
+          <w:lang w:val="fr-CA"/>
+        </w:rPr>
+        <w:t>.</w:t>
+      </w:r>
+    </w:p>
+    <w:p>
+      <w:pPr>
+        <w:rPr>
+          <w:lang w:val="fr-CA"/>
+        </w:rPr>
+      </w:pPr>
+      <w:r>
+        <w:rPr>
+          <w:lang w:val="fr-CA"/>
+        </w:rPr>
+        <w:t>.</w:t>
+      </w:r>
+    </w:p>
+    <w:p>
+      <w:pPr>
+        <w:rPr>
+          <w:lang w:val="fr-CA"/>
+        </w:rPr>
+      </w:pPr>
+      <w:r>
+        <w:rPr>
+          <w:lang w:val="fr-CA"/>
+        </w:rPr>
+        <w:t>Quelle est le code HEX pour ‘2’?</w:t>
+      </w:r>
+    </w:p>
+    <w:p>
+      <w:pPr>
+        <w:rPr>
+          <w:lang w:val="fr-CA"/>
+        </w:rPr>
+      </w:pPr>
+      <w:r>
+        <w:rPr>
+          <w:lang w:val="fr-CA"/>
+        </w:rPr>
+        <w:t>.</w:t>
+      </w:r>
+    </w:p>
+    <w:p>
+      <w:pPr>
+        <w:rPr>
+          <w:lang w:val="fr-CA"/>
+        </w:rPr>
+      </w:pPr>
+      <w:r>
+        <w:rPr>
+          <w:lang w:val="fr-CA"/>
+        </w:rPr>
+        <w:t>.</w:t>
+      </w:r>
+    </w:p>
+    <w:p>
+      <w:pPr>
+        <w:rPr>
+          <w:lang w:val="fr-CA"/>
+        </w:rPr>
+      </w:pPr>
+      <w:r>
+        <w:rPr>
+          <w:lang w:val="fr-CA"/>
+        </w:rPr>
+        <w:t>.</w:t>
+      </w:r>
+    </w:p>
+    <w:p>
+      <w:pPr>
+        <w:rPr>
+          <w:lang w:val="fr-CA"/>
+        </w:rPr>
+      </w:pPr>
+      <w:r>
+        <w:rPr>
+          <w:lang w:val="fr-CA"/>
+        </w:rPr>
+        <w:t>.</w:t>
+      </w:r>
+    </w:p>
+    <w:p>
+      <w:pPr>
+        <w:rPr>
+          <w:lang w:val="fr-CA"/>
+        </w:rPr>
+      </w:pPr>
+    </w:p>
+    <w:p>
+      <w:pPr>
+        <w:rPr>
+          <w:lang w:val="fr-CA"/>
+        </w:rPr>
+      </w:pPr>
+    </w:p>
+    <w:p>
+      <w:pPr>
+        <w:rPr>
+          <w:u w:val="single"/>
+          <w:lang w:val="fr-CA"/>
+        </w:rPr>
+      </w:pPr>
+    </w:p>
+    <w:p>
+      <w:pPr>
+        <w:rPr>
+          <w:u w:val="single"/>
+          <w:lang w:val="fr-CA"/>
+        </w:rPr>
+      </w:pPr>
+    </w:p>
+    <w:p>
+      <w:pPr>
+        <w:rPr>
+          <w:u w:val="single"/>
+          <w:lang w:val="fr-CA"/>
+        </w:rPr>
+      </w:pPr>
+    </w:p>
+    <w:p>
+      <w:pPr>
+        <w:rPr>
+          <w:u w:val="single"/>
+          <w:lang w:val="fr-CA"/>
+        </w:rPr>
+      </w:pPr>
+    </w:p>
+    <w:p>
+      <w:pPr>
+        <w:rPr>
+          <w:u w:val="single"/>
+          <w:lang w:val="fr-CA"/>
+        </w:rPr>
+      </w:pPr>
+    </w:p>
+    <w:p>
+      <w:pPr>
+        <w:pStyle w:val="Subtitle"/>
+        <w:rPr>
+          <w:lang w:val="fr-CA"/>
+        </w:rPr>
+      </w:pPr>
+      <w:r>
+        <w:rPr>
+          <w:lang w:val="fr-CA"/>
+        </w:rPr>
         <w:t xml:space="preserve">Partie </w:t>
       </w:r>
       <w:r>
         <w:rPr>
           <w:lang w:val="fr-CA"/>
         </w:rPr>
-        <w:t>2</w:t>
-      </w:r>
-      <w:r>
-        <w:rPr>
-          <w:lang w:val="fr-CA"/>
-        </w:rPr>
-        <w:t xml:space="preserve"> (INFRAROUGE)</w:t>
-      </w:r>
-    </w:p>
-    <w:p>
-      <w:pPr>
-        <w:rPr>
-          <w:lang w:val="fr-CA"/>
-        </w:rPr>
-      </w:pPr>
-      <w:r>
-        <w:rPr>
-          <w:lang w:val="fr-CA"/>
-        </w:rPr>
-        <w:t>Trame à l’oscilloscope de ‘0’</w:t>
-      </w:r>
-    </w:p>
-    <w:p>
-      <w:pPr>
-        <w:rPr>
-          <w:lang w:val="fr-CA"/>
-        </w:rPr>
-      </w:pPr>
-      <w:r>
-        <w:rPr>
-          <w:lang w:val="fr-CA"/>
-        </w:rPr>
-        <w:t>.</w:t>
-      </w:r>
-    </w:p>
-    <w:p>
-      <w:pPr>
-        <w:rPr>
-          <w:lang w:val="fr-CA"/>
-        </w:rPr>
-      </w:pPr>
-      <w:r>
-        <w:rPr>
-          <w:lang w:val="fr-CA"/>
-        </w:rPr>
-        <w:t>.</w:t>
-      </w:r>
-    </w:p>
-    <w:p>
-      <w:pPr>
-        <w:rPr>
-          <w:lang w:val="fr-CA"/>
-        </w:rPr>
-      </w:pPr>
-      <w:r>
-        <w:rPr>
-          <w:lang w:val="fr-CA"/>
-        </w:rPr>
-        <w:t>.</w:t>
-      </w:r>
-    </w:p>
-    <w:p>
-      <w:pPr>
-        <w:rPr>
-          <w:lang w:val="fr-CA"/>
-        </w:rPr>
-      </w:pPr>
-      <w:r>
-        <w:rPr>
-          <w:lang w:val="fr-CA"/>
-        </w:rPr>
-        <w:t>.</w:t>
-      </w:r>
-    </w:p>
-    <w:p>
-      <w:pPr>
-        <w:rPr>
-          <w:lang w:val="fr-CA"/>
-        </w:rPr>
-      </w:pPr>
-      <w:r>
-        <w:rPr>
-          <w:lang w:val="fr-CA"/>
-        </w:rPr>
-        <w:t>Trame à l’oscilloscope de ‘REPEAT’</w:t>
-      </w:r>
-    </w:p>
-    <w:p>
-      <w:pPr>
-        <w:rPr>
-          <w:lang w:val="fr-CA"/>
-        </w:rPr>
-      </w:pPr>
-      <w:r>
-        <w:rPr>
-          <w:lang w:val="fr-CA"/>
-        </w:rPr>
-        <w:t>.</w:t>
-      </w:r>
-    </w:p>
-    <w:p>
-      <w:pPr>
-        <w:rPr>
-          <w:lang w:val="fr-CA"/>
-        </w:rPr>
-      </w:pPr>
-      <w:r>
-        <w:rPr>
-          <w:lang w:val="fr-CA"/>
-        </w:rPr>
-        <w:t>.</w:t>
-      </w:r>
-    </w:p>
-    <w:p>
-      <w:pPr>
-        <w:rPr>
-          <w:lang w:val="fr-CA"/>
-        </w:rPr>
-      </w:pPr>
-      <w:r>
-        <w:rPr>
-          <w:lang w:val="fr-CA"/>
-        </w:rPr>
-        <w:t>.</w:t>
-      </w:r>
-    </w:p>
-    <w:p>
-      <w:pPr>
-        <w:rPr>
-          <w:lang w:val="fr-CA"/>
-        </w:rPr>
-      </w:pPr>
-      <w:r>
-        <w:rPr>
-          <w:lang w:val="fr-CA"/>
-        </w:rPr>
-        <w:t>.</w:t>
-      </w:r>
-    </w:p>
-    <w:p>
-      <w:pPr>
-        <w:rPr>
-          <w:lang w:val="fr-CA"/>
-        </w:rPr>
-      </w:pPr>
-      <w:r>
-        <w:rPr>
-          <w:lang w:val="fr-CA"/>
-        </w:rPr>
-        <w:t>Distance entre les trames ‘REPEAT’?</w:t>
-      </w:r>
-      <w:r>
-        <w:rPr>
-          <w:lang w:val="fr-CA"/>
-        </w:rPr>
-        <w:t xml:space="preserve"> (En ms)</w:t>
-      </w:r>
-    </w:p>
-    <w:p>
-      <w:pPr>
-        <w:rPr>
-          <w:lang w:val="fr-CA"/>
-        </w:rPr>
-      </w:pPr>
-      <w:r>
-        <w:rPr>
-          <w:lang w:val="fr-CA"/>
-        </w:rPr>
-        <w:t>.</w:t>
-      </w:r>
-    </w:p>
-    <w:p>
-      <w:pPr>
-        <w:rPr>
-          <w:lang w:val="fr-CA"/>
-        </w:rPr>
-      </w:pPr>
-      <w:r>
-        <w:rPr>
-          <w:lang w:val="fr-CA"/>
-        </w:rPr>
-        <w:t>.</w:t>
-      </w:r>
-    </w:p>
-    <w:p>
-      <w:pPr>
-        <w:rPr>
-          <w:lang w:val="fr-CA"/>
-        </w:rPr>
-      </w:pPr>
-      <w:r>
-        <w:rPr>
-          <w:lang w:val="fr-CA"/>
-        </w:rPr>
-        <w:t>.</w:t>
-      </w:r>
-    </w:p>
-    <w:p>
-      <w:pPr>
-        <w:rPr>
-          <w:lang w:val="fr-CA"/>
-        </w:rPr>
-      </w:pPr>
-      <w:r>
-        <w:rPr>
-          <w:lang w:val="fr-CA"/>
-        </w:rPr>
-        <w:t>.</w:t>
-      </w:r>
-    </w:p>
-    <w:p>
-      <w:pPr>
-        <w:rPr>
-          <w:lang w:val="fr-CA"/>
-        </w:rPr>
-      </w:pPr>
-      <w:r>
-        <w:rPr>
-          <w:lang w:val="fr-CA"/>
-        </w:rPr>
-        <w:t>Quelle est le code HEX pour ‘2’?</w:t>
-      </w:r>
-    </w:p>
-    <w:p>
-      <w:pPr>
-        <w:rPr>
-          <w:lang w:val="fr-CA"/>
-        </w:rPr>
-      </w:pPr>
-      <w:r>
-        <w:rPr>
-          <w:lang w:val="fr-CA"/>
-        </w:rPr>
-        <w:t>.</w:t>
-      </w:r>
-    </w:p>
-    <w:p>
-      <w:pPr>
-        <w:rPr>
-          <w:lang w:val="fr-CA"/>
-        </w:rPr>
-      </w:pPr>
-      <w:r>
-        <w:rPr>
-          <w:lang w:val="fr-CA"/>
-        </w:rPr>
-        <w:t>.</w:t>
-      </w:r>
-    </w:p>
-    <w:p>
-      <w:pPr>
-        <w:rPr>
-          <w:lang w:val="fr-CA"/>
-        </w:rPr>
-      </w:pPr>
-      <w:r>
-        <w:rPr>
-          <w:lang w:val="fr-CA"/>
-        </w:rPr>
-        <w:t>.</w:t>
-      </w:r>
-    </w:p>
-    <w:p>
-      <w:pPr>
-        <w:rPr>
-          <w:lang w:val="fr-CA"/>
-        </w:rPr>
-      </w:pPr>
-      <w:r>
-        <w:rPr>
-          <w:lang w:val="fr-CA"/>
-        </w:rPr>
-        <w:t>.</w:t>
-      </w:r>
-    </w:p>
-    <w:p>
-      <w:pPr>
-        <w:rPr>
-          <w:lang w:val="fr-CA"/>
-        </w:rPr>
-      </w:pPr>
-    </w:p>
-    <w:p>
-      <w:pPr>
-        <w:rPr>
-          <w:lang w:val="fr-CA"/>
-        </w:rPr>
-      </w:pPr>
-    </w:p>
-    <w:p>
-      <w:pPr>
-        <w:rPr>
-          <w:u w:val="single"/>
-          <w:lang w:val="fr-CA"/>
-        </w:rPr>
-      </w:pPr>
-    </w:p>
-    <w:p>
-      <w:pPr>
-        <w:rPr>
-          <w:u w:val="single"/>
-          <w:lang w:val="fr-CA"/>
-        </w:rPr>
-      </w:pPr>
-    </w:p>
-    <w:p>
-      <w:pPr>
-        <w:rPr>
-          <w:u w:val="single"/>
-          <w:lang w:val="fr-CA"/>
-        </w:rPr>
-      </w:pPr>
-    </w:p>
-    <w:p>
-      <w:pPr>
-        <w:rPr>
-          <w:u w:val="single"/>
-          <w:lang w:val="fr-CA"/>
-        </w:rPr>
-      </w:pPr>
-    </w:p>
-    <w:p>
-      <w:pPr>
-        <w:rPr>
-          <w:u w:val="single"/>
-          <w:lang w:val="fr-CA"/>
-        </w:rPr>
-      </w:pPr>
-    </w:p>
-    <w:p>
-      <w:pPr>
-        <w:pStyle w:val="Subtitle"/>
+        <w:t>3</w:t>
+      </w:r>
+      <w:r>
+        <w:rPr>
+          <w:lang w:val="fr-CA"/>
+        </w:rPr>
+        <w:t xml:space="preserve"> (LED </w:t>
+      </w:r>
+      <w:proofErr w:type="spellStart"/>
+      <w:r>
+        <w:rPr>
+          <w:lang w:val="fr-CA"/>
+        </w:rPr>
+        <w:t>strips</w:t>
+      </w:r>
+      <w:proofErr w:type="spellEnd"/>
+      <w:r>
+        <w:rPr>
+          <w:lang w:val="fr-CA"/>
+        </w:rPr>
+        <w:t>)</w:t>
+      </w:r>
+    </w:p>
+    <w:p>
+      <w:pPr>
+        <w:rPr>
+          <w:lang w:val="fr-CA"/>
+        </w:rPr>
+      </w:pPr>
+      <w:r>
+        <w:rPr>
+          <w:lang w:val="fr-CA"/>
+        </w:rPr>
+        <w:t>Trame à l’oscilloscope ‘Vert’ sur 1 DEL</w:t>
+      </w:r>
+    </w:p>
+    <w:p>
+      <w:pPr>
+        <w:rPr>
+          <w:lang w:val="fr-CA"/>
+        </w:rPr>
+      </w:pPr>
+      <w:r>
+        <w:rPr>
+          <w:lang w:val="fr-CA"/>
+        </w:rPr>
+        <w:t>.</w:t>
+      </w:r>
+    </w:p>
+    <w:p>
+      <w:pPr>
+        <w:rPr>
+          <w:lang w:val="fr-CA"/>
+        </w:rPr>
+      </w:pPr>
+      <w:r>
+        <w:rPr>
+          <w:lang w:val="fr-CA"/>
+        </w:rPr>
+        <w:t>.</w:t>
+      </w:r>
+    </w:p>
+    <w:p>
+      <w:pPr>
+        <w:rPr>
+          <w:lang w:val="fr-CA"/>
+        </w:rPr>
+      </w:pPr>
+      <w:r>
+        <w:rPr>
+          <w:lang w:val="fr-CA"/>
+        </w:rPr>
+        <w:t>.</w:t>
+      </w:r>
+    </w:p>
+    <w:p>
+      <w:pPr>
         <w:rPr>
           <w:lang w:val="fr-CA"/>
         </w:rPr>
@@ -792,123 +825,20 @@
           <w:lang w:val="fr-CA"/>
         </w:rPr>
         <w:lastRenderedPageBreak/>
-        <w:t xml:space="preserve">Partie </w:t>
-      </w:r>
-      <w:r>
-        <w:rPr>
-          <w:lang w:val="fr-CA"/>
-        </w:rPr>
-        <w:t>3</w:t>
-      </w:r>
-      <w:r>
-        <w:rPr>
-          <w:lang w:val="fr-CA"/>
-        </w:rPr>
-        <w:t xml:space="preserve"> (LED </w:t>
-      </w:r>
-      <w:proofErr w:type="spellStart"/>
-      <w:r>
-        <w:rPr>
-          <w:lang w:val="fr-CA"/>
-        </w:rPr>
-        <w:t>strips</w:t>
-      </w:r>
-      <w:proofErr w:type="spellEnd"/>
-      <w:r>
-        <w:rPr>
-          <w:lang w:val="fr-CA"/>
-        </w:rPr>
-        <w:t>)</w:t>
-      </w:r>
-    </w:p>
-    <w:p>
-      <w:pPr>
-        <w:rPr>
-          <w:lang w:val="fr-CA"/>
-        </w:rPr>
-      </w:pPr>
-      <w:r>
-        <w:rPr>
-          <w:lang w:val="fr-CA"/>
-        </w:rPr>
-        <w:t>Trame à l’oscilloscope ‘Vert’ sur 1 DEL</w:t>
-      </w:r>
-    </w:p>
-    <w:p>
-      <w:pPr>
-        <w:rPr>
-          <w:lang w:val="fr-CA"/>
-        </w:rPr>
-      </w:pPr>
-      <w:r>
-        <w:rPr>
-          <w:lang w:val="fr-CA"/>
-        </w:rPr>
-        <w:t>.</w:t>
-      </w:r>
-    </w:p>
-    <w:p>
-      <w:pPr>
-        <w:rPr>
-          <w:lang w:val="fr-CA"/>
-        </w:rPr>
-      </w:pPr>
-      <w:r>
-        <w:rPr>
-          <w:lang w:val="fr-CA"/>
-        </w:rPr>
-        <w:t>.</w:t>
-      </w:r>
-    </w:p>
-    <w:p>
-      <w:pPr>
-        <w:rPr>
-          <w:lang w:val="fr-CA"/>
-        </w:rPr>
-      </w:pPr>
-      <w:r>
-        <w:rPr>
-          <w:lang w:val="fr-CA"/>
-        </w:rPr>
-        <w:t>.</w:t>
-      </w:r>
-    </w:p>
-    <w:p>
-      <w:pPr>
-        <w:rPr>
-          <w:lang w:val="fr-CA"/>
-        </w:rPr>
-      </w:pPr>
-      <w:r>
-        <w:rPr>
-          <w:lang w:val="fr-CA"/>
-        </w:rPr>
-        <w:t>.</w:t>
-      </w:r>
-    </w:p>
-    <w:p>
-      <w:pPr>
-        <w:rPr>
-          <w:lang w:val="fr-CA"/>
-        </w:rPr>
-      </w:pPr>
-      <w:r>
-        <w:rPr>
-          <w:lang w:val="fr-CA"/>
-        </w:rPr>
-        <w:t>Trame à l’oscilloscope ‘</w:t>
-      </w:r>
-      <w:r>
-        <w:rPr>
-          <w:lang w:val="fr-CA"/>
-        </w:rPr>
-        <w:t>Rouge</w:t>
-      </w:r>
-      <w:r>
-        <w:rPr>
-          <w:lang w:val="fr-CA"/>
-        </w:rPr>
-        <w:t xml:space="preserve"> sur 1 DEL</w:t>
+        <w:t>.</w:t>
+      </w:r>
+    </w:p>
+    <w:p>
+      <w:pPr>
+        <w:rPr>
+          <w:lang w:val="fr-CA"/>
+        </w:rPr>
+      </w:pPr>
+      <w:r>
+        <w:rPr>
+          <w:lang w:val="fr-CA"/>
+        </w:rPr>
+        <w:t>Trame à l’oscilloscope ‘Rouge sur 1 DEL</w:t>
       </w:r>
     </w:p>
     <w:p>
@@ -988,109 +918,79 @@
         <w:rPr>
           <w:lang w:val="fr-CA"/>
         </w:rPr>
-        <w:t>Trame à l’oscilloscope ‘</w:t>
-      </w:r>
-      <w:r>
-        <w:rPr>
-          <w:lang w:val="fr-CA"/>
-        </w:rPr>
-        <w:t>Bleu</w:t>
-      </w:r>
-      <w:r>
-        <w:rPr>
-          <w:lang w:val="fr-CA"/>
-        </w:rPr>
-        <w:t xml:space="preserve"> sur 1 DEL</w:t>
-      </w:r>
-    </w:p>
-    <w:p>
-      <w:pPr>
-        <w:rPr>
-          <w:lang w:val="fr-CA"/>
-        </w:rPr>
-      </w:pPr>
-      <w:r>
-        <w:rPr>
-          <w:lang w:val="fr-CA"/>
-        </w:rPr>
-        <w:t>.</w:t>
-      </w:r>
-    </w:p>
-    <w:p>
-      <w:pPr>
-        <w:rPr>
-          <w:lang w:val="fr-CA"/>
-        </w:rPr>
-      </w:pPr>
-      <w:r>
-        <w:rPr>
-          <w:lang w:val="fr-CA"/>
-        </w:rPr>
-        <w:t>.</w:t>
-      </w:r>
-    </w:p>
-    <w:p>
-      <w:pPr>
-        <w:rPr>
-          <w:lang w:val="fr-CA"/>
-        </w:rPr>
-      </w:pPr>
-      <w:r>
-        <w:rPr>
-          <w:lang w:val="fr-CA"/>
-        </w:rPr>
-        <w:t>.</w:t>
-      </w:r>
-    </w:p>
-    <w:p>
-      <w:pPr>
-        <w:rPr>
-          <w:lang w:val="fr-CA"/>
-        </w:rPr>
-      </w:pPr>
-      <w:r>
-        <w:rPr>
-          <w:lang w:val="fr-CA"/>
-        </w:rPr>
-        <w:t>.</w:t>
-      </w:r>
-    </w:p>
-    <w:p>
-      <w:pPr>
-        <w:rPr>
-          <w:lang w:val="fr-CA"/>
-        </w:rPr>
-      </w:pPr>
-      <w:r>
-        <w:rPr>
-          <w:lang w:val="fr-CA"/>
-        </w:rPr>
-        <w:t xml:space="preserve">Trame à l’oscilloscope ‘Vert’ sur </w:t>
-      </w:r>
-      <w:r>
-        <w:rPr>
-          <w:lang w:val="fr-CA"/>
-        </w:rPr>
-        <w:t>2</w:t>
-      </w:r>
-      <w:r>
-        <w:rPr>
-          <w:lang w:val="fr-CA"/>
-        </w:rPr>
-        <w:t xml:space="preserve"> </w:t>
+        <w:t>Trame à l’oscilloscope ‘Bleu sur 1 DEL</w:t>
+      </w:r>
+    </w:p>
+    <w:p>
+      <w:pPr>
+        <w:rPr>
+          <w:lang w:val="fr-CA"/>
+        </w:rPr>
+      </w:pPr>
+      <w:r>
+        <w:rPr>
+          <w:lang w:val="fr-CA"/>
+        </w:rPr>
+        <w:t>.</w:t>
+      </w:r>
+    </w:p>
+    <w:p>
+      <w:pPr>
+        <w:rPr>
+          <w:lang w:val="fr-CA"/>
+        </w:rPr>
+      </w:pPr>
+      <w:r>
+        <w:rPr>
+          <w:lang w:val="fr-CA"/>
+        </w:rPr>
+        <w:t>.</w:t>
+      </w:r>
+    </w:p>
+    <w:p>
+      <w:pPr>
+        <w:rPr>
+          <w:lang w:val="fr-CA"/>
+        </w:rPr>
+      </w:pPr>
+      <w:r>
+        <w:rPr>
+          <w:lang w:val="fr-CA"/>
+        </w:rPr>
+        <w:t>.</w:t>
+      </w:r>
+    </w:p>
+    <w:p>
+      <w:pPr>
+        <w:rPr>
+          <w:lang w:val="fr-CA"/>
+        </w:rPr>
+      </w:pPr>
+      <w:r>
+        <w:rPr>
+          <w:lang w:val="fr-CA"/>
+        </w:rPr>
+        <w:t>.</w:t>
+      </w:r>
+    </w:p>
+    <w:p>
+      <w:pPr>
+        <w:rPr>
+          <w:lang w:val="fr-CA"/>
+        </w:rPr>
+      </w:pPr>
+      <w:r>
+        <w:rPr>
+          <w:lang w:val="fr-CA"/>
+        </w:rPr>
+        <w:t xml:space="preserve">Trame à l’oscilloscope ‘Vert’ sur 2 </w:t>
       </w:r>
       <w:proofErr w:type="spellStart"/>
       <w:r>
         <w:rPr>
           <w:lang w:val="fr-CA"/>
         </w:rPr>
-        <w:t>DEL</w:t>
-      </w:r>
-      <w:r>
-        <w:rPr>
-          <w:lang w:val="fr-CA"/>
-        </w:rPr>
-        <w:t>s</w:t>
+        <w:t>DELs</w:t>
       </w:r>
       <w:proofErr w:type="spellEnd"/>
     </w:p>
@@ -1156,13 +1056,7 @@
         <w:rPr>
           <w:lang w:val="fr-CA"/>
         </w:rPr>
-        <w:t>Trame à l’oscilloscope ‘</w:t>
-      </w:r>
-      <w:r>
-        <w:rPr>
-          <w:lang w:val="fr-CA"/>
-        </w:rPr>
-        <w:t>Noir/Ét</w:t>
+        <w:t>Trame à l’oscilloscope ‘Noir/Ét</w:t>
       </w:r>
       <w:r>
         <w:rPr>
@@ -1174,19 +1068,7 @@
         <w:rPr>
           <w:lang w:val="fr-CA"/>
         </w:rPr>
-        <w:t>int</w:t>
-      </w:r>
-      <w:r>
-        <w:rPr>
-          <w:lang w:val="fr-CA"/>
-        </w:rPr>
-        <w:t>’ sur 1 DEL</w:t>
-      </w:r>
-      <w:r>
-        <w:rPr>
-          <w:lang w:val="fr-CA"/>
-        </w:rPr>
-        <w:t xml:space="preserve"> ET annoter sur l’image la section Verte, Rouge et Bleu de la DEL</w:t>
+        <w:t>int’ sur 1 DEL ET annoter sur l’image la section Verte, Rouge et Bleu de la DEL</w:t>
       </w:r>
     </w:p>
     <w:p>

</xml_diff>